<commit_message>
Add K-Means walkthrough and PDF; clean images
Add a comprehensive K-Means walkthrough (PROJECT/explaination walkthrough code.md) that documents the satellite image segmentation GUI and algorithm. Add PROJECT/K-cluster.pdf and update PROJECT/K-cluster.docx. Remove five extracted images from PROJECT/sheet3_extract (cleanup of redundant/assets). No functional code changes.
</commit_message>
<xml_diff>
--- a/PROJECT/K-cluster.docx
+++ b/PROJECT/K-cluster.docx
@@ -283,6 +283,108 @@
     </w:p>
     <w:p>
       <w:r>
+        <w:tab/>
+        <w:t xml:space="preserve">So </w:t>
+      </w:r>
+      <w:r>
+        <w:t>again,</w:t>
+      </w:r>
+      <w:r>
+        <w:t xml:space="preserve"> </w:t>
+      </w:r>
+      <w:r>
+        <w:t>let’s</w:t>
+      </w:r>
+      <w:r>
+        <w:t xml:space="preserve"> see k-means algorithms step-by-step</w:t>
+      </w:r>
+    </w:p>
+    <w:p>
+      <w:pPr>
+        <w:pStyle w:val="ListParagraph"/>
+        <w:numPr>
+          <w:ilvl w:val="0"/>
+          <w:numId w:val="16"/>
+        </w:numPr>
+      </w:pPr>
+      <w:r>
+        <w:t xml:space="preserve">Initialization: We select </w:t>
+      </w:r>
+      <w:r>
+        <w:t>K</w:t>
+      </w:r>
+      <w:r>
+        <w:t>; initial centroids.</w:t>
+      </w:r>
+    </w:p>
+    <w:p>
+      <w:pPr>
+        <w:pStyle w:val="ListParagraph"/>
+        <w:numPr>
+          <w:ilvl w:val="0"/>
+          <w:numId w:val="16"/>
+        </w:numPr>
+      </w:pPr>
+      <w:r>
+        <w:t>Assignment: We calculate the distance between every single pixel</w:t>
+      </w:r>
+      <w:r>
+        <w:t xml:space="preserve"> </w:t>
+      </w:r>
+      <w:r>
+        <w:t>in the image and the K centroids.</w:t>
+      </w:r>
+    </w:p>
+    <w:p>
+      <w:pPr>
+        <w:pStyle w:val="ListParagraph"/>
+        <w:numPr>
+          <w:ilvl w:val="0"/>
+          <w:numId w:val="16"/>
+        </w:numPr>
+      </w:pPr>
+      <w:r>
+        <w:t>Centroid Update: Once all pixels are assigned, we recompute the position of each</w:t>
+      </w:r>
+      <w:r>
+        <w:t xml:space="preserve"> </w:t>
+      </w:r>
+      <w:r>
+        <w:t>centroid.</w:t>
+      </w:r>
+    </w:p>
+    <w:p>
+      <w:pPr>
+        <w:pStyle w:val="ListParagraph"/>
+        <w:numPr>
+          <w:ilvl w:val="0"/>
+          <w:numId w:val="16"/>
+        </w:numPr>
+      </w:pPr>
+      <w:r>
+        <w:t>Convergence Check: We compare the new centroids to the old ones. If they haven</w:t>
+      </w:r>
+      <w:r>
+        <w:t>’</w:t>
+      </w:r>
+      <w:r>
+        <w:t>t</w:t>
+      </w:r>
+      <w:r>
+        <w:t xml:space="preserve"> </w:t>
+      </w:r>
+      <w:r>
+        <w:t>moved (or changed minimally)</w:t>
+      </w:r>
+      <w:r>
+        <w:t>.</w:t>
+      </w:r>
+    </w:p>
+    <w:p>
+      <w:r>
+        <w:rPr>
+          <w:noProof/>
+        </w:rPr>
         <w:drawing>
           <wp:inline distT="0" distB="0" distL="0" distR="0" wp14:anchorId="43AFD467" wp14:editId="53AD09FF">
             <wp:extent cx="2129191" cy="2140527"/>
@@ -321,8 +423,780 @@
       </w:r>
     </w:p>
     <w:p/>
+    <w:p/>
+    <w:p>
+      <w:pPr>
+        <w:pStyle w:val="Heading1"/>
+      </w:pPr>
+      <w:r>
+        <w:lastRenderedPageBreak/>
+        <w:t>The Core Concept: Pixels as Data Points</w:t>
+      </w:r>
+    </w:p>
+    <w:p>
+      <w:r>
+        <w:t>K-means clustering groups satellite image pixels into K distinct clusters based on color or spectral values. Each pixel becomes a data point in a multi-band space. The algorithm assigns pixels to the nearest cluster center, then updates center iteratively until pixel groupings stop changing.</w:t>
+      </w:r>
+    </w:p>
+    <w:p>
+      <w:r>
+        <w:rPr>
+          <w:noProof/>
+        </w:rPr>
+        <w:drawing>
+          <wp:inline distT="0" distB="0" distL="0" distR="0" wp14:anchorId="50858BB8" wp14:editId="735B312B">
+            <wp:extent cx="5486400" cy="3122930"/>
+            <wp:effectExtent l="0" t="0" r="0" b="1270"/>
+            <wp:docPr id="233916877" name="Picture 1" descr="Semantic Segmentation of Remote Sensing Imagery using k-Means | Towards Data  Science"/>
+            <wp:cNvGraphicFramePr>
+              <a:graphicFrameLocks xmlns:a="http://schemas.openxmlformats.org/drawingml/2006/main" noChangeAspect="1"/>
+            </wp:cNvGraphicFramePr>
+            <a:graphic xmlns:a="http://schemas.openxmlformats.org/drawingml/2006/main">
+              <a:graphicData uri="http://schemas.openxmlformats.org/drawingml/2006/picture">
+                <pic:pic xmlns:pic="http://schemas.openxmlformats.org/drawingml/2006/picture">
+                  <pic:nvPicPr>
+                    <pic:cNvPr id="0" name="Picture 1" descr="Semantic Segmentation of Remote Sensing Imagery using k-Means | Towards Data  Science"/>
+                    <pic:cNvPicPr>
+                      <a:picLocks noChangeAspect="1" noChangeArrowheads="1"/>
+                    </pic:cNvPicPr>
+                  </pic:nvPicPr>
+                  <pic:blipFill>
+                    <a:blip r:embed="rId10">
+                      <a:extLst>
+                        <a:ext uri="{28A0092B-C50C-407E-A947-70E740481C1C}">
+                          <a14:useLocalDpi xmlns:a14="http://schemas.microsoft.com/office/drawing/2010/main" val="0"/>
+                        </a:ext>
+                      </a:extLst>
+                    </a:blip>
+                    <a:srcRect/>
+                    <a:stretch>
+                      <a:fillRect/>
+                    </a:stretch>
+                  </pic:blipFill>
+                  <pic:spPr bwMode="auto">
+                    <a:xfrm>
+                      <a:off x="0" y="0"/>
+                      <a:ext cx="5486400" cy="3122930"/>
+                    </a:xfrm>
+                    <a:prstGeom prst="rect">
+                      <a:avLst/>
+                    </a:prstGeom>
+                    <a:noFill/>
+                    <a:ln>
+                      <a:noFill/>
+                    </a:ln>
+                  </pic:spPr>
+                </pic:pic>
+              </a:graphicData>
+            </a:graphic>
+          </wp:inline>
+        </w:drawing>
+      </w:r>
+    </w:p>
+    <w:p>
+      <w:pPr>
+        <w:pStyle w:val="Heading1"/>
+      </w:pPr>
+      <w:r>
+        <w:t xml:space="preserve">Impact of the </w:t>
+      </w:r>
+      <w:r>
+        <w:t>‘</w:t>
+      </w:r>
+      <w:r>
+        <w:t>K</w:t>
+      </w:r>
+      <w:r>
+        <w:t>’</w:t>
+      </w:r>
+      <w:r>
+        <w:t xml:space="preserve"> Value</w:t>
+      </w:r>
+    </w:p>
+    <w:p>
+      <w:r>
+        <w:t>The hyperparameter K dictates the number of segments the image will be divided into:</w:t>
+      </w:r>
+    </w:p>
+    <w:p>
+      <w:pPr>
+        <w:pStyle w:val="ListParagraph"/>
+        <w:numPr>
+          <w:ilvl w:val="0"/>
+          <w:numId w:val="24"/>
+        </w:numPr>
+      </w:pPr>
+      <w:r>
+        <w:t>K = 3: Forces the algorithm to broadly classify the image into the three most dominant features (e.g., deep water, shallow water/vegetation, and desert/land). This provides a macro-level overview of the geography.</w:t>
+      </w:r>
+    </w:p>
+    <w:p>
+      <w:pPr>
+        <w:pStyle w:val="ListParagraph"/>
+        <w:numPr>
+          <w:ilvl w:val="0"/>
+          <w:numId w:val="24"/>
+        </w:numPr>
+      </w:pPr>
+      <w:r>
+        <w:t>K = 5: Allows for more granular segmentation. The algorithm can distinguish between subtle variations, such as different types of soil, varying depths/sediment levels in water, and dense vs. sparse vegetation.</w:t>
+      </w:r>
+    </w:p>
+    <w:p/>
+    <w:p/>
+    <w:p/>
+    <w:p/>
+    <w:p>
+      <w:pPr>
+        <w:pStyle w:val="Heading1"/>
+      </w:pPr>
+      <w:r>
+        <w:lastRenderedPageBreak/>
+        <w:t>Distance Metrics: Euclidean vs. Manhattan</w:t>
+      </w:r>
+    </w:p>
+    <w:p>
+      <w:r>
+        <w:t xml:space="preserve">We implemented two specific mathematical approaches to calculate the ‘closeness’ of a pixel to a centroid using </w:t>
+      </w:r>
+      <w:r>
+        <w:rPr>
+          <w:b/>
+          <w:bCs/>
+        </w:rPr>
+        <w:t>Euclidean Distance</w:t>
+      </w:r>
+      <w:r>
+        <w:t xml:space="preserve"> &amp; </w:t>
+      </w:r>
+      <w:r>
+        <w:rPr>
+          <w:b/>
+          <w:bCs/>
+        </w:rPr>
+        <w:t>Manhattan Distance</w:t>
+      </w:r>
+      <w:r>
+        <w:t>.</w:t>
+      </w:r>
+    </w:p>
+    <w:p>
+      <w:pPr>
+        <w:pStyle w:val="Heading2"/>
+      </w:pPr>
+      <w:r>
+        <w:t>Euclidean Distance (L2 Norm)</w:t>
+      </w:r>
+    </w:p>
+    <w:p>
+      <w:r>
+        <w:t>Euclidean distance tends to form spherical clusters and heavily penalizes large differences in any single-color channel due to the squaring operation.</w:t>
+      </w:r>
+    </w:p>
+    <w:p>
+      <w:pPr>
+        <w:pStyle w:val="ListParagraph"/>
+        <w:numPr>
+          <w:ilvl w:val="0"/>
+          <w:numId w:val="21"/>
+        </w:numPr>
+      </w:pPr>
+      <w:r>
+        <w:rPr>
+          <w:b/>
+          <w:bCs/>
+        </w:rPr>
+        <w:t>Data Preparation:</w:t>
+      </w:r>
+      <w:r>
+        <w:t xml:space="preserve"> Reshape the multi-band satellite raster (e.g., RGB or multispectral bands like NIR, Red, Green) into a 2D array where each row is a pixel and columns are spectral features. </w:t>
+      </w:r>
+    </w:p>
+    <w:p>
+      <w:pPr>
+        <w:pStyle w:val="ListParagraph"/>
+        <w:numPr>
+          <w:ilvl w:val="0"/>
+          <w:numId w:val="21"/>
+        </w:numPr>
+      </w:pPr>
+      <w:r>
+        <w:rPr>
+          <w:b/>
+          <w:bCs/>
+        </w:rPr>
+        <w:t>Initialization:</w:t>
+      </w:r>
+      <w:r>
+        <w:t xml:space="preserve"> Choose K and pick random initial cluster centers (centroids) in the multi-dimensional spectral space.</w:t>
+      </w:r>
+    </w:p>
+    <w:p>
+      <w:pPr>
+        <w:pStyle w:val="ListParagraph"/>
+        <w:numPr>
+          <w:ilvl w:val="0"/>
+          <w:numId w:val="21"/>
+        </w:numPr>
+      </w:pPr>
+      <w:r>
+        <w:rPr>
+          <w:b/>
+          <w:bCs/>
+        </w:rPr>
+        <w:t>Distance Calculation:</w:t>
+      </w:r>
+      <w:r>
+        <w:t xml:space="preserve"> Compute the Euclidean distance (L₂ norm</w:t>
+      </w:r>
+      <w:r>
+        <w:t xml:space="preserve">) </w:t>
+      </w:r>
+      <m:oMath>
+        <m:r>
+          <w:rPr>
+            <w:rFonts w:ascii="Cambria Math" w:hAnsi="Cambria Math"/>
+          </w:rPr>
+          <m:t>d</m:t>
+        </m:r>
+        <m:d>
+          <m:dPr>
+            <m:ctrlPr>
+              <w:rPr>
+                <w:rFonts w:ascii="Cambria Math" w:hAnsi="Cambria Math"/>
+              </w:rPr>
+            </m:ctrlPr>
+          </m:dPr>
+          <m:e>
+            <m:r>
+              <w:rPr>
+                <w:rFonts w:ascii="Cambria Math" w:hAnsi="Cambria Math"/>
+              </w:rPr>
+              <m:t>p,c</m:t>
+            </m:r>
+          </m:e>
+        </m:d>
+        <m:r>
+          <w:rPr>
+            <w:rFonts w:ascii="Cambria Math" w:hAnsi="Cambria Math"/>
+          </w:rPr>
+          <m:t>=</m:t>
+        </m:r>
+        <m:rad>
+          <m:radPr>
+            <m:degHide m:val="1"/>
+            <m:ctrlPr>
+              <w:rPr>
+                <w:rFonts w:ascii="Cambria Math" w:hAnsi="Cambria Math"/>
+              </w:rPr>
+            </m:ctrlPr>
+          </m:radPr>
+          <m:deg/>
+          <m:e>
+            <m:nary>
+              <m:naryPr>
+                <m:chr m:val="∑"/>
+                <m:limLoc m:val="undOvr"/>
+                <m:subHide m:val="1"/>
+                <m:supHide m:val="1"/>
+                <m:ctrlPr>
+                  <w:rPr>
+                    <w:rFonts w:ascii="Cambria Math" w:hAnsi="Cambria Math"/>
+                  </w:rPr>
+                </m:ctrlPr>
+              </m:naryPr>
+              <m:sub/>
+              <m:sup/>
+              <m:e>
+                <m:sSup>
+                  <m:sSupPr>
+                    <m:ctrlPr>
+                      <w:rPr>
+                        <w:rFonts w:ascii="Cambria Math" w:hAnsi="Cambria Math"/>
+                      </w:rPr>
+                    </m:ctrlPr>
+                  </m:sSupPr>
+                  <m:e>
+                    <m:d>
+                      <m:dPr>
+                        <m:ctrlPr>
+                          <w:rPr>
+                            <w:rFonts w:ascii="Cambria Math" w:hAnsi="Cambria Math"/>
+                          </w:rPr>
+                        </m:ctrlPr>
+                      </m:dPr>
+                      <m:e>
+                        <m:sSub>
+                          <m:sSubPr>
+                            <m:ctrlPr>
+                              <w:rPr>
+                                <w:rFonts w:ascii="Cambria Math" w:hAnsi="Cambria Math"/>
+                              </w:rPr>
+                            </m:ctrlPr>
+                          </m:sSubPr>
+                          <m:e>
+                            <m:r>
+                              <w:rPr>
+                                <w:rFonts w:ascii="Cambria Math" w:hAnsi="Cambria Math"/>
+                              </w:rPr>
+                              <m:t>p</m:t>
+                            </m:r>
+                          </m:e>
+                          <m:sub>
+                            <m:r>
+                              <w:rPr>
+                                <w:rFonts w:ascii="Cambria Math" w:hAnsi="Cambria Math"/>
+                              </w:rPr>
+                              <m:t>i</m:t>
+                            </m:r>
+                          </m:sub>
+                        </m:sSub>
+                        <m:r>
+                          <w:rPr>
+                            <w:rFonts w:ascii="Cambria Math" w:hAnsi="Cambria Math"/>
+                          </w:rPr>
+                          <m:t>-</m:t>
+                        </m:r>
+                        <m:sSub>
+                          <m:sSubPr>
+                            <m:ctrlPr>
+                              <w:rPr>
+                                <w:rFonts w:ascii="Cambria Math" w:hAnsi="Cambria Math"/>
+                              </w:rPr>
+                            </m:ctrlPr>
+                          </m:sSubPr>
+                          <m:e>
+                            <m:r>
+                              <w:rPr>
+                                <w:rFonts w:ascii="Cambria Math" w:hAnsi="Cambria Math"/>
+                              </w:rPr>
+                              <m:t>c</m:t>
+                            </m:r>
+                          </m:e>
+                          <m:sub>
+                            <m:r>
+                              <w:rPr>
+                                <w:rFonts w:ascii="Cambria Math" w:hAnsi="Cambria Math"/>
+                              </w:rPr>
+                              <m:t>i</m:t>
+                            </m:r>
+                          </m:sub>
+                        </m:sSub>
+                      </m:e>
+                    </m:d>
+                  </m:e>
+                  <m:sup>
+                    <m:r>
+                      <w:rPr>
+                        <w:rFonts w:ascii="Cambria Math" w:hAnsi="Cambria Math"/>
+                      </w:rPr>
+                      <m:t>2</m:t>
+                    </m:r>
+                  </m:sup>
+                </m:sSup>
+              </m:e>
+            </m:nary>
+          </m:e>
+        </m:rad>
+        <m:r>
+          <w:rPr>
+            <w:rFonts w:ascii="Cambria Math" w:hAnsi="Cambria Math"/>
+          </w:rPr>
+          <m:t xml:space="preserve"> </m:t>
+        </m:r>
+      </m:oMath>
+      <w:r>
+        <w:t>between each pixel vector p and centroid c.</w:t>
+      </w:r>
+    </w:p>
+    <w:p>
+      <w:pPr>
+        <w:pStyle w:val="ListParagraph"/>
+        <w:numPr>
+          <w:ilvl w:val="0"/>
+          <w:numId w:val="21"/>
+        </w:numPr>
+      </w:pPr>
+      <w:r>
+        <w:rPr>
+          <w:b/>
+          <w:bCs/>
+        </w:rPr>
+        <w:t>Assignment &amp; Update:</w:t>
+      </w:r>
+      <w:r>
+        <w:t xml:space="preserve"> </w:t>
+      </w:r>
+      <w:r>
+        <w:t>Assign each pixel to the nearest centroid, then recompute centroids as the mean of all assigned pixels. Repeat until convergence.</w:t>
+      </w:r>
+    </w:p>
+    <w:p>
+      <w:pPr>
+        <w:pStyle w:val="Heading2"/>
+      </w:pPr>
+      <w:r>
+        <w:t>Manhattan Distance (L1 Norm)</w:t>
+      </w:r>
+    </w:p>
+    <w:p>
+      <w:pPr>
+        <w:rPr>
+          <w:b/>
+          <w:bCs/>
+        </w:rPr>
+      </w:pPr>
+      <w:r>
+        <w:t>Manhattan distance is generally more robust to outliers than Euclidean distance and tends to form diamond-shaped clusters in the feature space.</w:t>
+      </w:r>
+      <w:r>
+        <w:rPr>
+          <w:rFonts w:ascii="Arial" w:eastAsia="Times New Roman" w:hAnsi="Arial" w:cs="Arial"/>
+          <w:b/>
+          <w:bCs/>
+          <w:color w:val="auto"/>
+          <w:sz w:val="30"/>
+          <w:szCs w:val="30"/>
+          <w:lang w:eastAsia="zh-CN"/>
+        </w:rPr>
+        <w:t xml:space="preserve"> </w:t>
+      </w:r>
+      <w:r>
+        <w:rPr>
+          <w:b/>
+          <w:bCs/>
+        </w:rPr>
+        <w:t>How K-Means Works with Manhattan Distance</w:t>
+      </w:r>
+    </w:p>
+    <w:p>
+      <w:pPr>
+        <w:pStyle w:val="ListParagraph"/>
+        <w:numPr>
+          <w:ilvl w:val="0"/>
+          <w:numId w:val="23"/>
+        </w:numPr>
+      </w:pPr>
+      <w:r>
+        <w:rPr>
+          <w:b/>
+          <w:bCs/>
+        </w:rPr>
+        <w:t>Pixel Representation</w:t>
+      </w:r>
+      <w:r>
+        <w:t>: Each pixel is a vector in a multi-dimensional space (e.g., Red, Green, Blue, or multi-spectral bands like NIR).</w:t>
+      </w:r>
+    </w:p>
+    <w:p>
+      <w:pPr>
+        <w:pStyle w:val="ListParagraph"/>
+        <w:numPr>
+          <w:ilvl w:val="0"/>
+          <w:numId w:val="23"/>
+        </w:numPr>
+      </w:pPr>
+      <w:r>
+        <w:rPr>
+          <w:b/>
+          <w:bCs/>
+        </w:rPr>
+        <w:t>Distance Formula</w:t>
+      </w:r>
+      <w:r>
+        <w:t>: Computes the sum of absolute differences between pixel values and cluster centroids:</w:t>
+      </w:r>
+      <m:oMath>
+        <m:r>
+          <w:rPr>
+            <w:rFonts w:ascii="Cambria Math" w:hAnsi="Cambria Math"/>
+          </w:rPr>
+          <m:t>D=</m:t>
+        </m:r>
+        <m:nary>
+          <m:naryPr>
+            <m:chr m:val="∑"/>
+            <m:limLoc m:val="undOvr"/>
+            <m:subHide m:val="1"/>
+            <m:supHide m:val="1"/>
+            <m:ctrlPr>
+              <w:rPr>
+                <w:rFonts w:ascii="Cambria Math" w:hAnsi="Cambria Math"/>
+              </w:rPr>
+            </m:ctrlPr>
+          </m:naryPr>
+          <m:sub/>
+          <m:sup/>
+          <m:e>
+            <m:r>
+              <w:rPr>
+                <w:rFonts w:ascii="Cambria Math" w:hAnsi="Cambria Math"/>
+              </w:rPr>
+              <m:t>|</m:t>
+            </m:r>
+          </m:e>
+        </m:nary>
+        <m:sSub>
+          <m:sSubPr>
+            <m:ctrlPr>
+              <w:rPr>
+                <w:rFonts w:ascii="Cambria Math" w:hAnsi="Cambria Math"/>
+              </w:rPr>
+            </m:ctrlPr>
+          </m:sSubPr>
+          <m:e>
+            <m:r>
+              <w:rPr>
+                <w:rFonts w:ascii="Cambria Math" w:hAnsi="Cambria Math"/>
+              </w:rPr>
+              <m:t>x</m:t>
+            </m:r>
+          </m:e>
+          <m:sub>
+            <m:r>
+              <w:rPr>
+                <w:rFonts w:ascii="Cambria Math" w:hAnsi="Cambria Math"/>
+              </w:rPr>
+              <m:t>i</m:t>
+            </m:r>
+          </m:sub>
+        </m:sSub>
+        <m:r>
+          <w:rPr>
+            <w:rFonts w:ascii="Cambria Math" w:hAnsi="Cambria Math"/>
+          </w:rPr>
+          <m:t>-</m:t>
+        </m:r>
+        <m:sSub>
+          <m:sSubPr>
+            <m:ctrlPr>
+              <w:rPr>
+                <w:rFonts w:ascii="Cambria Math" w:hAnsi="Cambria Math"/>
+              </w:rPr>
+            </m:ctrlPr>
+          </m:sSubPr>
+          <m:e>
+            <m:r>
+              <w:rPr>
+                <w:rFonts w:ascii="Cambria Math" w:hAnsi="Cambria Math"/>
+              </w:rPr>
+              <m:t>x</m:t>
+            </m:r>
+          </m:e>
+          <m:sub>
+            <m:r>
+              <w:rPr>
+                <w:rFonts w:ascii="Cambria Math" w:hAnsi="Cambria Math"/>
+              </w:rPr>
+              <m:t>i</m:t>
+            </m:r>
+          </m:sub>
+        </m:sSub>
+        <m:r>
+          <w:rPr>
+            <w:rFonts w:ascii="Cambria Math" w:hAnsi="Cambria Math"/>
+          </w:rPr>
+          <m:t>|</m:t>
+        </m:r>
+      </m:oMath>
+    </w:p>
+    <w:p>
+      <w:pPr>
+        <w:pStyle w:val="ListParagraph"/>
+        <w:numPr>
+          <w:ilvl w:val="0"/>
+          <w:numId w:val="23"/>
+        </w:numPr>
+      </w:pPr>
+      <w:r>
+        <w:rPr>
+          <w:b/>
+          <w:bCs/>
+        </w:rPr>
+        <w:t>Centroid Update</w:t>
+      </w:r>
+      <w:r>
+        <w:t>: Uses the median instead of the mean during the update step to strictly minimize the Manhattan objective, though standard K-Means variants sometimes retain the mean</w:t>
+      </w:r>
+    </w:p>
+    <w:p>
+      <w:r>
+        <w:rPr>
+          <w:noProof/>
+        </w:rPr>
+        <w:drawing>
+          <wp:inline distT="0" distB="0" distL="0" distR="0" wp14:anchorId="7606E9F3" wp14:editId="0DD569A5">
+            <wp:extent cx="2743200" cy="1805940"/>
+            <wp:effectExtent l="0" t="0" r="0" b="3810"/>
+            <wp:docPr id="1875201226" name="Picture 2" descr="K Means Clustering: Finding natural groups | by ML Bites | Medium"/>
+            <wp:cNvGraphicFramePr>
+              <a:graphicFrameLocks xmlns:a="http://schemas.openxmlformats.org/drawingml/2006/main" noChangeAspect="1"/>
+            </wp:cNvGraphicFramePr>
+            <a:graphic xmlns:a="http://schemas.openxmlformats.org/drawingml/2006/main">
+              <a:graphicData uri="http://schemas.openxmlformats.org/drawingml/2006/picture">
+                <pic:pic xmlns:pic="http://schemas.openxmlformats.org/drawingml/2006/picture">
+                  <pic:nvPicPr>
+                    <pic:cNvPr id="0" name="Picture 3" descr="K Means Clustering: Finding natural groups | by ML Bites | Medium"/>
+                    <pic:cNvPicPr>
+                      <a:picLocks noChangeAspect="1" noChangeArrowheads="1"/>
+                    </pic:cNvPicPr>
+                  </pic:nvPicPr>
+                  <pic:blipFill>
+                    <a:blip r:embed="rId11">
+                      <a:extLst>
+                        <a:ext uri="{28A0092B-C50C-407E-A947-70E740481C1C}">
+                          <a14:useLocalDpi xmlns:a14="http://schemas.microsoft.com/office/drawing/2010/main" val="0"/>
+                        </a:ext>
+                      </a:extLst>
+                    </a:blip>
+                    <a:srcRect/>
+                    <a:stretch>
+                      <a:fillRect/>
+                    </a:stretch>
+                  </pic:blipFill>
+                  <pic:spPr bwMode="auto">
+                    <a:xfrm>
+                      <a:off x="0" y="0"/>
+                      <a:ext cx="2794635" cy="1839801"/>
+                    </a:xfrm>
+                    <a:prstGeom prst="rect">
+                      <a:avLst/>
+                    </a:prstGeom>
+                    <a:noFill/>
+                    <a:ln>
+                      <a:noFill/>
+                    </a:ln>
+                  </pic:spPr>
+                </pic:pic>
+              </a:graphicData>
+            </a:graphic>
+          </wp:inline>
+        </w:drawing>
+      </w:r>
+      <w:r>
+        <w:rPr>
+          <w:noProof/>
+        </w:rPr>
+        <w:drawing>
+          <wp:inline distT="0" distB="0" distL="0" distR="0" wp14:anchorId="2AADDE19" wp14:editId="56A10D45">
+            <wp:extent cx="2694709" cy="1827482"/>
+            <wp:effectExtent l="0" t="0" r="0" b="1905"/>
+            <wp:docPr id="514755301" name="Picture 3" descr="K Means Clustering: Finding natural groups | by ML Bites | Medium"/>
+            <wp:cNvGraphicFramePr>
+              <a:graphicFrameLocks xmlns:a="http://schemas.openxmlformats.org/drawingml/2006/main" noChangeAspect="1"/>
+            </wp:cNvGraphicFramePr>
+            <a:graphic xmlns:a="http://schemas.openxmlformats.org/drawingml/2006/main">
+              <a:graphicData uri="http://schemas.openxmlformats.org/drawingml/2006/picture">
+                <pic:pic xmlns:pic="http://schemas.openxmlformats.org/drawingml/2006/picture">
+                  <pic:nvPicPr>
+                    <pic:cNvPr id="0" name="Picture 5" descr="K Means Clustering: Finding natural groups | by ML Bites | Medium"/>
+                    <pic:cNvPicPr>
+                      <a:picLocks noChangeAspect="1" noChangeArrowheads="1"/>
+                    </pic:cNvPicPr>
+                  </pic:nvPicPr>
+                  <pic:blipFill>
+                    <a:blip r:embed="rId12">
+                      <a:extLst>
+                        <a:ext uri="{28A0092B-C50C-407E-A947-70E740481C1C}">
+                          <a14:useLocalDpi xmlns:a14="http://schemas.microsoft.com/office/drawing/2010/main" val="0"/>
+                        </a:ext>
+                      </a:extLst>
+                    </a:blip>
+                    <a:srcRect/>
+                    <a:stretch>
+                      <a:fillRect/>
+                    </a:stretch>
+                  </pic:blipFill>
+                  <pic:spPr bwMode="auto">
+                    <a:xfrm>
+                      <a:off x="0" y="0"/>
+                      <a:ext cx="2735707" cy="1855286"/>
+                    </a:xfrm>
+                    <a:prstGeom prst="rect">
+                      <a:avLst/>
+                    </a:prstGeom>
+                    <a:noFill/>
+                    <a:ln>
+                      <a:noFill/>
+                    </a:ln>
+                  </pic:spPr>
+                </pic:pic>
+              </a:graphicData>
+            </a:graphic>
+          </wp:inline>
+        </w:drawing>
+      </w:r>
+    </w:p>
+    <w:p>
+      <w:pPr>
+        <w:pStyle w:val="Heading1"/>
+      </w:pPr>
+      <w:r>
+        <w:lastRenderedPageBreak/>
+        <w:t>CODING</w:t>
+      </w:r>
+    </w:p>
+    <w:p>
+      <w:r>
+        <w:t xml:space="preserve">This is the coding structure </w:t>
+      </w:r>
+    </w:p>
+    <w:p>
+      <w:r>
+        <w:drawing>
+          <wp:inline distT="0" distB="0" distL="0" distR="0" wp14:anchorId="7668D19C" wp14:editId="7C8F634A">
+            <wp:extent cx="5874540" cy="3726180"/>
+            <wp:effectExtent l="0" t="0" r="0" b="7620"/>
+            <wp:docPr id="1415145579" name="Picture 1"/>
+            <wp:cNvGraphicFramePr>
+              <a:graphicFrameLocks xmlns:a="http://schemas.openxmlformats.org/drawingml/2006/main" noChangeAspect="1"/>
+            </wp:cNvGraphicFramePr>
+            <a:graphic xmlns:a="http://schemas.openxmlformats.org/drawingml/2006/main">
+              <a:graphicData uri="http://schemas.openxmlformats.org/drawingml/2006/picture">
+                <pic:pic xmlns:pic="http://schemas.openxmlformats.org/drawingml/2006/picture">
+                  <pic:nvPicPr>
+                    <pic:cNvPr id="1415145579" name=""/>
+                    <pic:cNvPicPr/>
+                  </pic:nvPicPr>
+                  <pic:blipFill>
+                    <a:blip r:embed="rId13"/>
+                    <a:stretch>
+                      <a:fillRect/>
+                    </a:stretch>
+                  </pic:blipFill>
+                  <pic:spPr>
+                    <a:xfrm>
+                      <a:off x="0" y="0"/>
+                      <a:ext cx="5885439" cy="3733093"/>
+                    </a:xfrm>
+                    <a:prstGeom prst="rect">
+                      <a:avLst/>
+                    </a:prstGeom>
+                  </pic:spPr>
+                </pic:pic>
+              </a:graphicData>
+            </a:graphic>
+          </wp:inline>
+        </w:drawing>
+      </w:r>
+    </w:p>
+    <w:p/>
+    <w:p/>
+    <w:p>
+      <w:pPr>
+        <w:pStyle w:val="Heading1"/>
+      </w:pPr>
+      <w:r>
+        <w:t>Conclusion</w:t>
+      </w:r>
+    </w:p>
+    <w:p>
+      <w:r>
+        <w:t>By writing this algorithm from scratch using pure NumPy matrix operations, we successfully applied theoretical machine learning concepts to real-world remote sensing data. The vectorized implementation ensures that despite calculating distances for hundreds of thousands of pixels iteratively, the algorithm executes highly efficiently.</w:t>
+      </w:r>
+    </w:p>
     <w:sectPr>
-      <w:footerReference w:type="default" r:id="rId10"/>
+      <w:footerReference w:type="default" r:id="rId14"/>
       <w:pgSz w:w="12240" w:h="15840"/>
       <w:pgMar w:top="1728" w:right="1800" w:bottom="1440" w:left="1800" w:header="720" w:footer="720" w:gutter="0"/>
       <w:pgNumType w:start="0"/>
@@ -689,6 +1563,155 @@
     </w:lvl>
   </w:abstractNum>
   <w:abstractNum w:abstractNumId="11" w15:restartNumberingAfterBreak="0">
+    <w:nsid w:val="060467E6"/>
+    <w:multiLevelType w:val="multilevel"/>
+    <w:tmpl w:val="81DEACD6"/>
+    <w:lvl w:ilvl="0">
+      <w:start w:val="1"/>
+      <w:numFmt w:val="bullet"/>
+      <w:lvlText w:val=""/>
+      <w:lvlJc w:val="left"/>
+      <w:pPr>
+        <w:tabs>
+          <w:tab w:val="num" w:pos="720"/>
+        </w:tabs>
+        <w:ind w:left="720" w:hanging="360"/>
+      </w:pPr>
+      <w:rPr>
+        <w:rFonts w:ascii="Symbol" w:hAnsi="Symbol" w:hint="default"/>
+        <w:sz w:val="20"/>
+      </w:rPr>
+    </w:lvl>
+    <w:lvl w:ilvl="1" w:tentative="1">
+      <w:start w:val="1"/>
+      <w:numFmt w:val="bullet"/>
+      <w:lvlText w:val="o"/>
+      <w:lvlJc w:val="left"/>
+      <w:pPr>
+        <w:tabs>
+          <w:tab w:val="num" w:pos="1440"/>
+        </w:tabs>
+        <w:ind w:left="1440" w:hanging="360"/>
+      </w:pPr>
+      <w:rPr>
+        <w:rFonts w:ascii="Courier New" w:hAnsi="Courier New" w:hint="default"/>
+        <w:sz w:val="20"/>
+      </w:rPr>
+    </w:lvl>
+    <w:lvl w:ilvl="2" w:tentative="1">
+      <w:start w:val="1"/>
+      <w:numFmt w:val="bullet"/>
+      <w:lvlText w:val=""/>
+      <w:lvlJc w:val="left"/>
+      <w:pPr>
+        <w:tabs>
+          <w:tab w:val="num" w:pos="2160"/>
+        </w:tabs>
+        <w:ind w:left="2160" w:hanging="360"/>
+      </w:pPr>
+      <w:rPr>
+        <w:rFonts w:ascii="Wingdings" w:hAnsi="Wingdings" w:hint="default"/>
+        <w:sz w:val="20"/>
+      </w:rPr>
+    </w:lvl>
+    <w:lvl w:ilvl="3" w:tentative="1">
+      <w:start w:val="1"/>
+      <w:numFmt w:val="bullet"/>
+      <w:lvlText w:val=""/>
+      <w:lvlJc w:val="left"/>
+      <w:pPr>
+        <w:tabs>
+          <w:tab w:val="num" w:pos="2880"/>
+        </w:tabs>
+        <w:ind w:left="2880" w:hanging="360"/>
+      </w:pPr>
+      <w:rPr>
+        <w:rFonts w:ascii="Wingdings" w:hAnsi="Wingdings" w:hint="default"/>
+        <w:sz w:val="20"/>
+      </w:rPr>
+    </w:lvl>
+    <w:lvl w:ilvl="4" w:tentative="1">
+      <w:start w:val="1"/>
+      <w:numFmt w:val="bullet"/>
+      <w:lvlText w:val=""/>
+      <w:lvlJc w:val="left"/>
+      <w:pPr>
+        <w:tabs>
+          <w:tab w:val="num" w:pos="3600"/>
+        </w:tabs>
+        <w:ind w:left="3600" w:hanging="360"/>
+      </w:pPr>
+      <w:rPr>
+        <w:rFonts w:ascii="Wingdings" w:hAnsi="Wingdings" w:hint="default"/>
+        <w:sz w:val="20"/>
+      </w:rPr>
+    </w:lvl>
+    <w:lvl w:ilvl="5" w:tentative="1">
+      <w:start w:val="1"/>
+      <w:numFmt w:val="bullet"/>
+      <w:lvlText w:val=""/>
+      <w:lvlJc w:val="left"/>
+      <w:pPr>
+        <w:tabs>
+          <w:tab w:val="num" w:pos="4320"/>
+        </w:tabs>
+        <w:ind w:left="4320" w:hanging="360"/>
+      </w:pPr>
+      <w:rPr>
+        <w:rFonts w:ascii="Wingdings" w:hAnsi="Wingdings" w:hint="default"/>
+        <w:sz w:val="20"/>
+      </w:rPr>
+    </w:lvl>
+    <w:lvl w:ilvl="6" w:tentative="1">
+      <w:start w:val="1"/>
+      <w:numFmt w:val="bullet"/>
+      <w:lvlText w:val=""/>
+      <w:lvlJc w:val="left"/>
+      <w:pPr>
+        <w:tabs>
+          <w:tab w:val="num" w:pos="5040"/>
+        </w:tabs>
+        <w:ind w:left="5040" w:hanging="360"/>
+      </w:pPr>
+      <w:rPr>
+        <w:rFonts w:ascii="Wingdings" w:hAnsi="Wingdings" w:hint="default"/>
+        <w:sz w:val="20"/>
+      </w:rPr>
+    </w:lvl>
+    <w:lvl w:ilvl="7" w:tentative="1">
+      <w:start w:val="1"/>
+      <w:numFmt w:val="bullet"/>
+      <w:lvlText w:val=""/>
+      <w:lvlJc w:val="left"/>
+      <w:pPr>
+        <w:tabs>
+          <w:tab w:val="num" w:pos="5760"/>
+        </w:tabs>
+        <w:ind w:left="5760" w:hanging="360"/>
+      </w:pPr>
+      <w:rPr>
+        <w:rFonts w:ascii="Wingdings" w:hAnsi="Wingdings" w:hint="default"/>
+        <w:sz w:val="20"/>
+      </w:rPr>
+    </w:lvl>
+    <w:lvl w:ilvl="8" w:tentative="1">
+      <w:start w:val="1"/>
+      <w:numFmt w:val="bullet"/>
+      <w:lvlText w:val=""/>
+      <w:lvlJc w:val="left"/>
+      <w:pPr>
+        <w:tabs>
+          <w:tab w:val="num" w:pos="6480"/>
+        </w:tabs>
+        <w:ind w:left="6480" w:hanging="360"/>
+      </w:pPr>
+      <w:rPr>
+        <w:rFonts w:ascii="Wingdings" w:hAnsi="Wingdings" w:hint="default"/>
+        <w:sz w:val="20"/>
+      </w:rPr>
+    </w:lvl>
+  </w:abstractNum>
+  <w:abstractNum w:abstractNumId="12" w15:restartNumberingAfterBreak="0">
     <w:nsid w:val="0D483622"/>
     <w:multiLevelType w:val="multilevel"/>
     <w:tmpl w:val="04090023"/>
@@ -775,7 +1798,608 @@
       </w:pPr>
     </w:lvl>
   </w:abstractNum>
-  <w:abstractNum w:abstractNumId="12" w15:restartNumberingAfterBreak="0">
+  <w:abstractNum w:abstractNumId="13" w15:restartNumberingAfterBreak="0">
+    <w:nsid w:val="127F3E41"/>
+    <w:multiLevelType w:val="hybridMultilevel"/>
+    <w:tmpl w:val="FF225BA0"/>
+    <w:lvl w:ilvl="0" w:tplc="04090001">
+      <w:start w:val="1"/>
+      <w:numFmt w:val="bullet"/>
+      <w:lvlText w:val=""/>
+      <w:lvlJc w:val="left"/>
+      <w:pPr>
+        <w:ind w:left="1440" w:hanging="360"/>
+      </w:pPr>
+      <w:rPr>
+        <w:rFonts w:ascii="Symbol" w:hAnsi="Symbol" w:hint="default"/>
+      </w:rPr>
+    </w:lvl>
+    <w:lvl w:ilvl="1" w:tplc="04090003" w:tentative="1">
+      <w:start w:val="1"/>
+      <w:numFmt w:val="bullet"/>
+      <w:lvlText w:val="o"/>
+      <w:lvlJc w:val="left"/>
+      <w:pPr>
+        <w:ind w:left="2160" w:hanging="360"/>
+      </w:pPr>
+      <w:rPr>
+        <w:rFonts w:ascii="Courier New" w:hAnsi="Courier New" w:cs="Courier New" w:hint="default"/>
+      </w:rPr>
+    </w:lvl>
+    <w:lvl w:ilvl="2" w:tplc="04090005" w:tentative="1">
+      <w:start w:val="1"/>
+      <w:numFmt w:val="bullet"/>
+      <w:lvlText w:val=""/>
+      <w:lvlJc w:val="left"/>
+      <w:pPr>
+        <w:ind w:left="2880" w:hanging="360"/>
+      </w:pPr>
+      <w:rPr>
+        <w:rFonts w:ascii="Wingdings" w:hAnsi="Wingdings" w:hint="default"/>
+      </w:rPr>
+    </w:lvl>
+    <w:lvl w:ilvl="3" w:tplc="04090001" w:tentative="1">
+      <w:start w:val="1"/>
+      <w:numFmt w:val="bullet"/>
+      <w:lvlText w:val=""/>
+      <w:lvlJc w:val="left"/>
+      <w:pPr>
+        <w:ind w:left="3600" w:hanging="360"/>
+      </w:pPr>
+      <w:rPr>
+        <w:rFonts w:ascii="Symbol" w:hAnsi="Symbol" w:hint="default"/>
+      </w:rPr>
+    </w:lvl>
+    <w:lvl w:ilvl="4" w:tplc="04090003" w:tentative="1">
+      <w:start w:val="1"/>
+      <w:numFmt w:val="bullet"/>
+      <w:lvlText w:val="o"/>
+      <w:lvlJc w:val="left"/>
+      <w:pPr>
+        <w:ind w:left="4320" w:hanging="360"/>
+      </w:pPr>
+      <w:rPr>
+        <w:rFonts w:ascii="Courier New" w:hAnsi="Courier New" w:cs="Courier New" w:hint="default"/>
+      </w:rPr>
+    </w:lvl>
+    <w:lvl w:ilvl="5" w:tplc="04090005" w:tentative="1">
+      <w:start w:val="1"/>
+      <w:numFmt w:val="bullet"/>
+      <w:lvlText w:val=""/>
+      <w:lvlJc w:val="left"/>
+      <w:pPr>
+        <w:ind w:left="5040" w:hanging="360"/>
+      </w:pPr>
+      <w:rPr>
+        <w:rFonts w:ascii="Wingdings" w:hAnsi="Wingdings" w:hint="default"/>
+      </w:rPr>
+    </w:lvl>
+    <w:lvl w:ilvl="6" w:tplc="04090001" w:tentative="1">
+      <w:start w:val="1"/>
+      <w:numFmt w:val="bullet"/>
+      <w:lvlText w:val=""/>
+      <w:lvlJc w:val="left"/>
+      <w:pPr>
+        <w:ind w:left="5760" w:hanging="360"/>
+      </w:pPr>
+      <w:rPr>
+        <w:rFonts w:ascii="Symbol" w:hAnsi="Symbol" w:hint="default"/>
+      </w:rPr>
+    </w:lvl>
+    <w:lvl w:ilvl="7" w:tplc="04090003" w:tentative="1">
+      <w:start w:val="1"/>
+      <w:numFmt w:val="bullet"/>
+      <w:lvlText w:val="o"/>
+      <w:lvlJc w:val="left"/>
+      <w:pPr>
+        <w:ind w:left="6480" w:hanging="360"/>
+      </w:pPr>
+      <w:rPr>
+        <w:rFonts w:ascii="Courier New" w:hAnsi="Courier New" w:cs="Courier New" w:hint="default"/>
+      </w:rPr>
+    </w:lvl>
+    <w:lvl w:ilvl="8" w:tplc="04090005" w:tentative="1">
+      <w:start w:val="1"/>
+      <w:numFmt w:val="bullet"/>
+      <w:lvlText w:val=""/>
+      <w:lvlJc w:val="left"/>
+      <w:pPr>
+        <w:ind w:left="7200" w:hanging="360"/>
+      </w:pPr>
+      <w:rPr>
+        <w:rFonts w:ascii="Wingdings" w:hAnsi="Wingdings" w:hint="default"/>
+      </w:rPr>
+    </w:lvl>
+  </w:abstractNum>
+  <w:abstractNum w:abstractNumId="14" w15:restartNumberingAfterBreak="0">
+    <w:nsid w:val="15B200F0"/>
+    <w:multiLevelType w:val="hybridMultilevel"/>
+    <w:tmpl w:val="76C007D4"/>
+    <w:lvl w:ilvl="0" w:tplc="04090001">
+      <w:start w:val="1"/>
+      <w:numFmt w:val="bullet"/>
+      <w:lvlText w:val=""/>
+      <w:lvlJc w:val="left"/>
+      <w:pPr>
+        <w:ind w:left="720" w:hanging="360"/>
+      </w:pPr>
+      <w:rPr>
+        <w:rFonts w:ascii="Symbol" w:hAnsi="Symbol" w:hint="default"/>
+      </w:rPr>
+    </w:lvl>
+    <w:lvl w:ilvl="1" w:tplc="04090003" w:tentative="1">
+      <w:start w:val="1"/>
+      <w:numFmt w:val="bullet"/>
+      <w:lvlText w:val="o"/>
+      <w:lvlJc w:val="left"/>
+      <w:pPr>
+        <w:ind w:left="1440" w:hanging="360"/>
+      </w:pPr>
+      <w:rPr>
+        <w:rFonts w:ascii="Courier New" w:hAnsi="Courier New" w:cs="Courier New" w:hint="default"/>
+      </w:rPr>
+    </w:lvl>
+    <w:lvl w:ilvl="2" w:tplc="04090005" w:tentative="1">
+      <w:start w:val="1"/>
+      <w:numFmt w:val="bullet"/>
+      <w:lvlText w:val=""/>
+      <w:lvlJc w:val="left"/>
+      <w:pPr>
+        <w:ind w:left="2160" w:hanging="360"/>
+      </w:pPr>
+      <w:rPr>
+        <w:rFonts w:ascii="Wingdings" w:hAnsi="Wingdings" w:hint="default"/>
+      </w:rPr>
+    </w:lvl>
+    <w:lvl w:ilvl="3" w:tplc="04090001" w:tentative="1">
+      <w:start w:val="1"/>
+      <w:numFmt w:val="bullet"/>
+      <w:lvlText w:val=""/>
+      <w:lvlJc w:val="left"/>
+      <w:pPr>
+        <w:ind w:left="2880" w:hanging="360"/>
+      </w:pPr>
+      <w:rPr>
+        <w:rFonts w:ascii="Symbol" w:hAnsi="Symbol" w:hint="default"/>
+      </w:rPr>
+    </w:lvl>
+    <w:lvl w:ilvl="4" w:tplc="04090003" w:tentative="1">
+      <w:start w:val="1"/>
+      <w:numFmt w:val="bullet"/>
+      <w:lvlText w:val="o"/>
+      <w:lvlJc w:val="left"/>
+      <w:pPr>
+        <w:ind w:left="3600" w:hanging="360"/>
+      </w:pPr>
+      <w:rPr>
+        <w:rFonts w:ascii="Courier New" w:hAnsi="Courier New" w:cs="Courier New" w:hint="default"/>
+      </w:rPr>
+    </w:lvl>
+    <w:lvl w:ilvl="5" w:tplc="04090005" w:tentative="1">
+      <w:start w:val="1"/>
+      <w:numFmt w:val="bullet"/>
+      <w:lvlText w:val=""/>
+      <w:lvlJc w:val="left"/>
+      <w:pPr>
+        <w:ind w:left="4320" w:hanging="360"/>
+      </w:pPr>
+      <w:rPr>
+        <w:rFonts w:ascii="Wingdings" w:hAnsi="Wingdings" w:hint="default"/>
+      </w:rPr>
+    </w:lvl>
+    <w:lvl w:ilvl="6" w:tplc="04090001" w:tentative="1">
+      <w:start w:val="1"/>
+      <w:numFmt w:val="bullet"/>
+      <w:lvlText w:val=""/>
+      <w:lvlJc w:val="left"/>
+      <w:pPr>
+        <w:ind w:left="5040" w:hanging="360"/>
+      </w:pPr>
+      <w:rPr>
+        <w:rFonts w:ascii="Symbol" w:hAnsi="Symbol" w:hint="default"/>
+      </w:rPr>
+    </w:lvl>
+    <w:lvl w:ilvl="7" w:tplc="04090003" w:tentative="1">
+      <w:start w:val="1"/>
+      <w:numFmt w:val="bullet"/>
+      <w:lvlText w:val="o"/>
+      <w:lvlJc w:val="left"/>
+      <w:pPr>
+        <w:ind w:left="5760" w:hanging="360"/>
+      </w:pPr>
+      <w:rPr>
+        <w:rFonts w:ascii="Courier New" w:hAnsi="Courier New" w:cs="Courier New" w:hint="default"/>
+      </w:rPr>
+    </w:lvl>
+    <w:lvl w:ilvl="8" w:tplc="04090005" w:tentative="1">
+      <w:start w:val="1"/>
+      <w:numFmt w:val="bullet"/>
+      <w:lvlText w:val=""/>
+      <w:lvlJc w:val="left"/>
+      <w:pPr>
+        <w:ind w:left="6480" w:hanging="360"/>
+      </w:pPr>
+      <w:rPr>
+        <w:rFonts w:ascii="Wingdings" w:hAnsi="Wingdings" w:hint="default"/>
+      </w:rPr>
+    </w:lvl>
+  </w:abstractNum>
+  <w:abstractNum w:abstractNumId="15" w15:restartNumberingAfterBreak="0">
+    <w:nsid w:val="1B3D25F5"/>
+    <w:multiLevelType w:val="multilevel"/>
+    <w:tmpl w:val="BC8A8B5C"/>
+    <w:lvl w:ilvl="0">
+      <w:start w:val="1"/>
+      <w:numFmt w:val="bullet"/>
+      <w:lvlText w:val=""/>
+      <w:lvlJc w:val="left"/>
+      <w:pPr>
+        <w:tabs>
+          <w:tab w:val="num" w:pos="720"/>
+        </w:tabs>
+        <w:ind w:left="720" w:hanging="360"/>
+      </w:pPr>
+      <w:rPr>
+        <w:rFonts w:ascii="Symbol" w:hAnsi="Symbol" w:hint="default"/>
+        <w:sz w:val="20"/>
+      </w:rPr>
+    </w:lvl>
+    <w:lvl w:ilvl="1" w:tentative="1">
+      <w:start w:val="1"/>
+      <w:numFmt w:val="bullet"/>
+      <w:lvlText w:val="o"/>
+      <w:lvlJc w:val="left"/>
+      <w:pPr>
+        <w:tabs>
+          <w:tab w:val="num" w:pos="1440"/>
+        </w:tabs>
+        <w:ind w:left="1440" w:hanging="360"/>
+      </w:pPr>
+      <w:rPr>
+        <w:rFonts w:ascii="Courier New" w:hAnsi="Courier New" w:hint="default"/>
+        <w:sz w:val="20"/>
+      </w:rPr>
+    </w:lvl>
+    <w:lvl w:ilvl="2" w:tentative="1">
+      <w:start w:val="1"/>
+      <w:numFmt w:val="bullet"/>
+      <w:lvlText w:val=""/>
+      <w:lvlJc w:val="left"/>
+      <w:pPr>
+        <w:tabs>
+          <w:tab w:val="num" w:pos="2160"/>
+        </w:tabs>
+        <w:ind w:left="2160" w:hanging="360"/>
+      </w:pPr>
+      <w:rPr>
+        <w:rFonts w:ascii="Wingdings" w:hAnsi="Wingdings" w:hint="default"/>
+        <w:sz w:val="20"/>
+      </w:rPr>
+    </w:lvl>
+    <w:lvl w:ilvl="3" w:tentative="1">
+      <w:start w:val="1"/>
+      <w:numFmt w:val="bullet"/>
+      <w:lvlText w:val=""/>
+      <w:lvlJc w:val="left"/>
+      <w:pPr>
+        <w:tabs>
+          <w:tab w:val="num" w:pos="2880"/>
+        </w:tabs>
+        <w:ind w:left="2880" w:hanging="360"/>
+      </w:pPr>
+      <w:rPr>
+        <w:rFonts w:ascii="Wingdings" w:hAnsi="Wingdings" w:hint="default"/>
+        <w:sz w:val="20"/>
+      </w:rPr>
+    </w:lvl>
+    <w:lvl w:ilvl="4" w:tentative="1">
+      <w:start w:val="1"/>
+      <w:numFmt w:val="bullet"/>
+      <w:lvlText w:val=""/>
+      <w:lvlJc w:val="left"/>
+      <w:pPr>
+        <w:tabs>
+          <w:tab w:val="num" w:pos="3600"/>
+        </w:tabs>
+        <w:ind w:left="3600" w:hanging="360"/>
+      </w:pPr>
+      <w:rPr>
+        <w:rFonts w:ascii="Wingdings" w:hAnsi="Wingdings" w:hint="default"/>
+        <w:sz w:val="20"/>
+      </w:rPr>
+    </w:lvl>
+    <w:lvl w:ilvl="5" w:tentative="1">
+      <w:start w:val="1"/>
+      <w:numFmt w:val="bullet"/>
+      <w:lvlText w:val=""/>
+      <w:lvlJc w:val="left"/>
+      <w:pPr>
+        <w:tabs>
+          <w:tab w:val="num" w:pos="4320"/>
+        </w:tabs>
+        <w:ind w:left="4320" w:hanging="360"/>
+      </w:pPr>
+      <w:rPr>
+        <w:rFonts w:ascii="Wingdings" w:hAnsi="Wingdings" w:hint="default"/>
+        <w:sz w:val="20"/>
+      </w:rPr>
+    </w:lvl>
+    <w:lvl w:ilvl="6" w:tentative="1">
+      <w:start w:val="1"/>
+      <w:numFmt w:val="bullet"/>
+      <w:lvlText w:val=""/>
+      <w:lvlJc w:val="left"/>
+      <w:pPr>
+        <w:tabs>
+          <w:tab w:val="num" w:pos="5040"/>
+        </w:tabs>
+        <w:ind w:left="5040" w:hanging="360"/>
+      </w:pPr>
+      <w:rPr>
+        <w:rFonts w:ascii="Wingdings" w:hAnsi="Wingdings" w:hint="default"/>
+        <w:sz w:val="20"/>
+      </w:rPr>
+    </w:lvl>
+    <w:lvl w:ilvl="7" w:tentative="1">
+      <w:start w:val="1"/>
+      <w:numFmt w:val="bullet"/>
+      <w:lvlText w:val=""/>
+      <w:lvlJc w:val="left"/>
+      <w:pPr>
+        <w:tabs>
+          <w:tab w:val="num" w:pos="5760"/>
+        </w:tabs>
+        <w:ind w:left="5760" w:hanging="360"/>
+      </w:pPr>
+      <w:rPr>
+        <w:rFonts w:ascii="Wingdings" w:hAnsi="Wingdings" w:hint="default"/>
+        <w:sz w:val="20"/>
+      </w:rPr>
+    </w:lvl>
+    <w:lvl w:ilvl="8" w:tentative="1">
+      <w:start w:val="1"/>
+      <w:numFmt w:val="bullet"/>
+      <w:lvlText w:val=""/>
+      <w:lvlJc w:val="left"/>
+      <w:pPr>
+        <w:tabs>
+          <w:tab w:val="num" w:pos="6480"/>
+        </w:tabs>
+        <w:ind w:left="6480" w:hanging="360"/>
+      </w:pPr>
+      <w:rPr>
+        <w:rFonts w:ascii="Wingdings" w:hAnsi="Wingdings" w:hint="default"/>
+        <w:sz w:val="20"/>
+      </w:rPr>
+    </w:lvl>
+  </w:abstractNum>
+  <w:abstractNum w:abstractNumId="16" w15:restartNumberingAfterBreak="0">
+    <w:nsid w:val="1F50689B"/>
+    <w:multiLevelType w:val="hybridMultilevel"/>
+    <w:tmpl w:val="B33CB2DE"/>
+    <w:lvl w:ilvl="0" w:tplc="04090001">
+      <w:start w:val="1"/>
+      <w:numFmt w:val="bullet"/>
+      <w:lvlText w:val=""/>
+      <w:lvlJc w:val="left"/>
+      <w:pPr>
+        <w:ind w:left="1440" w:hanging="360"/>
+      </w:pPr>
+      <w:rPr>
+        <w:rFonts w:ascii="Symbol" w:hAnsi="Symbol" w:hint="default"/>
+      </w:rPr>
+    </w:lvl>
+    <w:lvl w:ilvl="1" w:tplc="04090003" w:tentative="1">
+      <w:start w:val="1"/>
+      <w:numFmt w:val="bullet"/>
+      <w:lvlText w:val="o"/>
+      <w:lvlJc w:val="left"/>
+      <w:pPr>
+        <w:ind w:left="2160" w:hanging="360"/>
+      </w:pPr>
+      <w:rPr>
+        <w:rFonts w:ascii="Courier New" w:hAnsi="Courier New" w:cs="Courier New" w:hint="default"/>
+      </w:rPr>
+    </w:lvl>
+    <w:lvl w:ilvl="2" w:tplc="04090005" w:tentative="1">
+      <w:start w:val="1"/>
+      <w:numFmt w:val="bullet"/>
+      <w:lvlText w:val=""/>
+      <w:lvlJc w:val="left"/>
+      <w:pPr>
+        <w:ind w:left="2880" w:hanging="360"/>
+      </w:pPr>
+      <w:rPr>
+        <w:rFonts w:ascii="Wingdings" w:hAnsi="Wingdings" w:hint="default"/>
+      </w:rPr>
+    </w:lvl>
+    <w:lvl w:ilvl="3" w:tplc="04090001" w:tentative="1">
+      <w:start w:val="1"/>
+      <w:numFmt w:val="bullet"/>
+      <w:lvlText w:val=""/>
+      <w:lvlJc w:val="left"/>
+      <w:pPr>
+        <w:ind w:left="3600" w:hanging="360"/>
+      </w:pPr>
+      <w:rPr>
+        <w:rFonts w:ascii="Symbol" w:hAnsi="Symbol" w:hint="default"/>
+      </w:rPr>
+    </w:lvl>
+    <w:lvl w:ilvl="4" w:tplc="04090003" w:tentative="1">
+      <w:start w:val="1"/>
+      <w:numFmt w:val="bullet"/>
+      <w:lvlText w:val="o"/>
+      <w:lvlJc w:val="left"/>
+      <w:pPr>
+        <w:ind w:left="4320" w:hanging="360"/>
+      </w:pPr>
+      <w:rPr>
+        <w:rFonts w:ascii="Courier New" w:hAnsi="Courier New" w:cs="Courier New" w:hint="default"/>
+      </w:rPr>
+    </w:lvl>
+    <w:lvl w:ilvl="5" w:tplc="04090005" w:tentative="1">
+      <w:start w:val="1"/>
+      <w:numFmt w:val="bullet"/>
+      <w:lvlText w:val=""/>
+      <w:lvlJc w:val="left"/>
+      <w:pPr>
+        <w:ind w:left="5040" w:hanging="360"/>
+      </w:pPr>
+      <w:rPr>
+        <w:rFonts w:ascii="Wingdings" w:hAnsi="Wingdings" w:hint="default"/>
+      </w:rPr>
+    </w:lvl>
+    <w:lvl w:ilvl="6" w:tplc="04090001" w:tentative="1">
+      <w:start w:val="1"/>
+      <w:numFmt w:val="bullet"/>
+      <w:lvlText w:val=""/>
+      <w:lvlJc w:val="left"/>
+      <w:pPr>
+        <w:ind w:left="5760" w:hanging="360"/>
+      </w:pPr>
+      <w:rPr>
+        <w:rFonts w:ascii="Symbol" w:hAnsi="Symbol" w:hint="default"/>
+      </w:rPr>
+    </w:lvl>
+    <w:lvl w:ilvl="7" w:tplc="04090003" w:tentative="1">
+      <w:start w:val="1"/>
+      <w:numFmt w:val="bullet"/>
+      <w:lvlText w:val="o"/>
+      <w:lvlJc w:val="left"/>
+      <w:pPr>
+        <w:ind w:left="6480" w:hanging="360"/>
+      </w:pPr>
+      <w:rPr>
+        <w:rFonts w:ascii="Courier New" w:hAnsi="Courier New" w:cs="Courier New" w:hint="default"/>
+      </w:rPr>
+    </w:lvl>
+    <w:lvl w:ilvl="8" w:tplc="04090005" w:tentative="1">
+      <w:start w:val="1"/>
+      <w:numFmt w:val="bullet"/>
+      <w:lvlText w:val=""/>
+      <w:lvlJc w:val="left"/>
+      <w:pPr>
+        <w:ind w:left="7200" w:hanging="360"/>
+      </w:pPr>
+      <w:rPr>
+        <w:rFonts w:ascii="Wingdings" w:hAnsi="Wingdings" w:hint="default"/>
+      </w:rPr>
+    </w:lvl>
+  </w:abstractNum>
+  <w:abstractNum w:abstractNumId="17" w15:restartNumberingAfterBreak="0">
+    <w:nsid w:val="2B8A7706"/>
+    <w:multiLevelType w:val="hybridMultilevel"/>
+    <w:tmpl w:val="C36E0EF0"/>
+    <w:lvl w:ilvl="0" w:tplc="04090001">
+      <w:start w:val="1"/>
+      <w:numFmt w:val="bullet"/>
+      <w:lvlText w:val=""/>
+      <w:lvlJc w:val="left"/>
+      <w:pPr>
+        <w:ind w:left="720" w:hanging="360"/>
+      </w:pPr>
+      <w:rPr>
+        <w:rFonts w:ascii="Symbol" w:hAnsi="Symbol" w:hint="default"/>
+      </w:rPr>
+    </w:lvl>
+    <w:lvl w:ilvl="1" w:tplc="04090003" w:tentative="1">
+      <w:start w:val="1"/>
+      <w:numFmt w:val="bullet"/>
+      <w:lvlText w:val="o"/>
+      <w:lvlJc w:val="left"/>
+      <w:pPr>
+        <w:ind w:left="1440" w:hanging="360"/>
+      </w:pPr>
+      <w:rPr>
+        <w:rFonts w:ascii="Courier New" w:hAnsi="Courier New" w:cs="Courier New" w:hint="default"/>
+      </w:rPr>
+    </w:lvl>
+    <w:lvl w:ilvl="2" w:tplc="04090005" w:tentative="1">
+      <w:start w:val="1"/>
+      <w:numFmt w:val="bullet"/>
+      <w:lvlText w:val=""/>
+      <w:lvlJc w:val="left"/>
+      <w:pPr>
+        <w:ind w:left="2160" w:hanging="360"/>
+      </w:pPr>
+      <w:rPr>
+        <w:rFonts w:ascii="Wingdings" w:hAnsi="Wingdings" w:hint="default"/>
+      </w:rPr>
+    </w:lvl>
+    <w:lvl w:ilvl="3" w:tplc="04090001" w:tentative="1">
+      <w:start w:val="1"/>
+      <w:numFmt w:val="bullet"/>
+      <w:lvlText w:val=""/>
+      <w:lvlJc w:val="left"/>
+      <w:pPr>
+        <w:ind w:left="2880" w:hanging="360"/>
+      </w:pPr>
+      <w:rPr>
+        <w:rFonts w:ascii="Symbol" w:hAnsi="Symbol" w:hint="default"/>
+      </w:rPr>
+    </w:lvl>
+    <w:lvl w:ilvl="4" w:tplc="04090003" w:tentative="1">
+      <w:start w:val="1"/>
+      <w:numFmt w:val="bullet"/>
+      <w:lvlText w:val="o"/>
+      <w:lvlJc w:val="left"/>
+      <w:pPr>
+        <w:ind w:left="3600" w:hanging="360"/>
+      </w:pPr>
+      <w:rPr>
+        <w:rFonts w:ascii="Courier New" w:hAnsi="Courier New" w:cs="Courier New" w:hint="default"/>
+      </w:rPr>
+    </w:lvl>
+    <w:lvl w:ilvl="5" w:tplc="04090005" w:tentative="1">
+      <w:start w:val="1"/>
+      <w:numFmt w:val="bullet"/>
+      <w:lvlText w:val=""/>
+      <w:lvlJc w:val="left"/>
+      <w:pPr>
+        <w:ind w:left="4320" w:hanging="360"/>
+      </w:pPr>
+      <w:rPr>
+        <w:rFonts w:ascii="Wingdings" w:hAnsi="Wingdings" w:hint="default"/>
+      </w:rPr>
+    </w:lvl>
+    <w:lvl w:ilvl="6" w:tplc="04090001" w:tentative="1">
+      <w:start w:val="1"/>
+      <w:numFmt w:val="bullet"/>
+      <w:lvlText w:val=""/>
+      <w:lvlJc w:val="left"/>
+      <w:pPr>
+        <w:ind w:left="5040" w:hanging="360"/>
+      </w:pPr>
+      <w:rPr>
+        <w:rFonts w:ascii="Symbol" w:hAnsi="Symbol" w:hint="default"/>
+      </w:rPr>
+    </w:lvl>
+    <w:lvl w:ilvl="7" w:tplc="04090003" w:tentative="1">
+      <w:start w:val="1"/>
+      <w:numFmt w:val="bullet"/>
+      <w:lvlText w:val="o"/>
+      <w:lvlJc w:val="left"/>
+      <w:pPr>
+        <w:ind w:left="5760" w:hanging="360"/>
+      </w:pPr>
+      <w:rPr>
+        <w:rFonts w:ascii="Courier New" w:hAnsi="Courier New" w:cs="Courier New" w:hint="default"/>
+      </w:rPr>
+    </w:lvl>
+    <w:lvl w:ilvl="8" w:tplc="04090005" w:tentative="1">
+      <w:start w:val="1"/>
+      <w:numFmt w:val="bullet"/>
+      <w:lvlText w:val=""/>
+      <w:lvlJc w:val="left"/>
+      <w:pPr>
+        <w:ind w:left="6480" w:hanging="360"/>
+      </w:pPr>
+      <w:rPr>
+        <w:rFonts w:ascii="Wingdings" w:hAnsi="Wingdings" w:hint="default"/>
+      </w:rPr>
+    </w:lvl>
+  </w:abstractNum>
+  <w:abstractNum w:abstractNumId="18" w15:restartNumberingAfterBreak="0">
     <w:nsid w:val="47164D09"/>
     <w:multiLevelType w:val="multilevel"/>
     <w:tmpl w:val="0409001F"/>
@@ -859,6 +2483,390 @@
       <w:pPr>
         <w:ind w:left="4320" w:hanging="1440"/>
       </w:pPr>
+    </w:lvl>
+  </w:abstractNum>
+  <w:abstractNum w:abstractNumId="19" w15:restartNumberingAfterBreak="0">
+    <w:nsid w:val="6D72713F"/>
+    <w:multiLevelType w:val="hybridMultilevel"/>
+    <w:tmpl w:val="A00ED69C"/>
+    <w:lvl w:ilvl="0" w:tplc="0409000F">
+      <w:start w:val="1"/>
+      <w:numFmt w:val="decimal"/>
+      <w:lvlText w:val="%1."/>
+      <w:lvlJc w:val="left"/>
+      <w:pPr>
+        <w:ind w:left="720" w:hanging="360"/>
+      </w:pPr>
+    </w:lvl>
+    <w:lvl w:ilvl="1" w:tplc="04090019" w:tentative="1">
+      <w:start w:val="1"/>
+      <w:numFmt w:val="lowerLetter"/>
+      <w:lvlText w:val="%2."/>
+      <w:lvlJc w:val="left"/>
+      <w:pPr>
+        <w:ind w:left="1440" w:hanging="360"/>
+      </w:pPr>
+    </w:lvl>
+    <w:lvl w:ilvl="2" w:tplc="0409001B" w:tentative="1">
+      <w:start w:val="1"/>
+      <w:numFmt w:val="lowerRoman"/>
+      <w:lvlText w:val="%3."/>
+      <w:lvlJc w:val="right"/>
+      <w:pPr>
+        <w:ind w:left="2160" w:hanging="180"/>
+      </w:pPr>
+    </w:lvl>
+    <w:lvl w:ilvl="3" w:tplc="0409000F" w:tentative="1">
+      <w:start w:val="1"/>
+      <w:numFmt w:val="decimal"/>
+      <w:lvlText w:val="%4."/>
+      <w:lvlJc w:val="left"/>
+      <w:pPr>
+        <w:ind w:left="2880" w:hanging="360"/>
+      </w:pPr>
+    </w:lvl>
+    <w:lvl w:ilvl="4" w:tplc="04090019" w:tentative="1">
+      <w:start w:val="1"/>
+      <w:numFmt w:val="lowerLetter"/>
+      <w:lvlText w:val="%5."/>
+      <w:lvlJc w:val="left"/>
+      <w:pPr>
+        <w:ind w:left="3600" w:hanging="360"/>
+      </w:pPr>
+    </w:lvl>
+    <w:lvl w:ilvl="5" w:tplc="0409001B" w:tentative="1">
+      <w:start w:val="1"/>
+      <w:numFmt w:val="lowerRoman"/>
+      <w:lvlText w:val="%6."/>
+      <w:lvlJc w:val="right"/>
+      <w:pPr>
+        <w:ind w:left="4320" w:hanging="180"/>
+      </w:pPr>
+    </w:lvl>
+    <w:lvl w:ilvl="6" w:tplc="0409000F" w:tentative="1">
+      <w:start w:val="1"/>
+      <w:numFmt w:val="decimal"/>
+      <w:lvlText w:val="%7."/>
+      <w:lvlJc w:val="left"/>
+      <w:pPr>
+        <w:ind w:left="5040" w:hanging="360"/>
+      </w:pPr>
+    </w:lvl>
+    <w:lvl w:ilvl="7" w:tplc="04090019" w:tentative="1">
+      <w:start w:val="1"/>
+      <w:numFmt w:val="lowerLetter"/>
+      <w:lvlText w:val="%8."/>
+      <w:lvlJc w:val="left"/>
+      <w:pPr>
+        <w:ind w:left="5760" w:hanging="360"/>
+      </w:pPr>
+    </w:lvl>
+    <w:lvl w:ilvl="8" w:tplc="0409001B" w:tentative="1">
+      <w:start w:val="1"/>
+      <w:numFmt w:val="lowerRoman"/>
+      <w:lvlText w:val="%9."/>
+      <w:lvlJc w:val="right"/>
+      <w:pPr>
+        <w:ind w:left="6480" w:hanging="180"/>
+      </w:pPr>
+    </w:lvl>
+  </w:abstractNum>
+  <w:abstractNum w:abstractNumId="20" w15:restartNumberingAfterBreak="0">
+    <w:nsid w:val="70FE1EEF"/>
+    <w:multiLevelType w:val="multilevel"/>
+    <w:tmpl w:val="B78613BA"/>
+    <w:lvl w:ilvl="0">
+      <w:start w:val="1"/>
+      <w:numFmt w:val="bullet"/>
+      <w:lvlText w:val=""/>
+      <w:lvlJc w:val="left"/>
+      <w:pPr>
+        <w:tabs>
+          <w:tab w:val="num" w:pos="720"/>
+        </w:tabs>
+        <w:ind w:left="720" w:hanging="360"/>
+      </w:pPr>
+      <w:rPr>
+        <w:rFonts w:ascii="Symbol" w:hAnsi="Symbol" w:hint="default"/>
+        <w:sz w:val="20"/>
+      </w:rPr>
+    </w:lvl>
+    <w:lvl w:ilvl="1" w:tentative="1">
+      <w:start w:val="1"/>
+      <w:numFmt w:val="bullet"/>
+      <w:lvlText w:val="o"/>
+      <w:lvlJc w:val="left"/>
+      <w:pPr>
+        <w:tabs>
+          <w:tab w:val="num" w:pos="1440"/>
+        </w:tabs>
+        <w:ind w:left="1440" w:hanging="360"/>
+      </w:pPr>
+      <w:rPr>
+        <w:rFonts w:ascii="Courier New" w:hAnsi="Courier New" w:hint="default"/>
+        <w:sz w:val="20"/>
+      </w:rPr>
+    </w:lvl>
+    <w:lvl w:ilvl="2" w:tentative="1">
+      <w:start w:val="1"/>
+      <w:numFmt w:val="bullet"/>
+      <w:lvlText w:val=""/>
+      <w:lvlJc w:val="left"/>
+      <w:pPr>
+        <w:tabs>
+          <w:tab w:val="num" w:pos="2160"/>
+        </w:tabs>
+        <w:ind w:left="2160" w:hanging="360"/>
+      </w:pPr>
+      <w:rPr>
+        <w:rFonts w:ascii="Wingdings" w:hAnsi="Wingdings" w:hint="default"/>
+        <w:sz w:val="20"/>
+      </w:rPr>
+    </w:lvl>
+    <w:lvl w:ilvl="3" w:tentative="1">
+      <w:start w:val="1"/>
+      <w:numFmt w:val="bullet"/>
+      <w:lvlText w:val=""/>
+      <w:lvlJc w:val="left"/>
+      <w:pPr>
+        <w:tabs>
+          <w:tab w:val="num" w:pos="2880"/>
+        </w:tabs>
+        <w:ind w:left="2880" w:hanging="360"/>
+      </w:pPr>
+      <w:rPr>
+        <w:rFonts w:ascii="Wingdings" w:hAnsi="Wingdings" w:hint="default"/>
+        <w:sz w:val="20"/>
+      </w:rPr>
+    </w:lvl>
+    <w:lvl w:ilvl="4" w:tentative="1">
+      <w:start w:val="1"/>
+      <w:numFmt w:val="bullet"/>
+      <w:lvlText w:val=""/>
+      <w:lvlJc w:val="left"/>
+      <w:pPr>
+        <w:tabs>
+          <w:tab w:val="num" w:pos="3600"/>
+        </w:tabs>
+        <w:ind w:left="3600" w:hanging="360"/>
+      </w:pPr>
+      <w:rPr>
+        <w:rFonts w:ascii="Wingdings" w:hAnsi="Wingdings" w:hint="default"/>
+        <w:sz w:val="20"/>
+      </w:rPr>
+    </w:lvl>
+    <w:lvl w:ilvl="5" w:tentative="1">
+      <w:start w:val="1"/>
+      <w:numFmt w:val="bullet"/>
+      <w:lvlText w:val=""/>
+      <w:lvlJc w:val="left"/>
+      <w:pPr>
+        <w:tabs>
+          <w:tab w:val="num" w:pos="4320"/>
+        </w:tabs>
+        <w:ind w:left="4320" w:hanging="360"/>
+      </w:pPr>
+      <w:rPr>
+        <w:rFonts w:ascii="Wingdings" w:hAnsi="Wingdings" w:hint="default"/>
+        <w:sz w:val="20"/>
+      </w:rPr>
+    </w:lvl>
+    <w:lvl w:ilvl="6" w:tentative="1">
+      <w:start w:val="1"/>
+      <w:numFmt w:val="bullet"/>
+      <w:lvlText w:val=""/>
+      <w:lvlJc w:val="left"/>
+      <w:pPr>
+        <w:tabs>
+          <w:tab w:val="num" w:pos="5040"/>
+        </w:tabs>
+        <w:ind w:left="5040" w:hanging="360"/>
+      </w:pPr>
+      <w:rPr>
+        <w:rFonts w:ascii="Wingdings" w:hAnsi="Wingdings" w:hint="default"/>
+        <w:sz w:val="20"/>
+      </w:rPr>
+    </w:lvl>
+    <w:lvl w:ilvl="7" w:tentative="1">
+      <w:start w:val="1"/>
+      <w:numFmt w:val="bullet"/>
+      <w:lvlText w:val=""/>
+      <w:lvlJc w:val="left"/>
+      <w:pPr>
+        <w:tabs>
+          <w:tab w:val="num" w:pos="5760"/>
+        </w:tabs>
+        <w:ind w:left="5760" w:hanging="360"/>
+      </w:pPr>
+      <w:rPr>
+        <w:rFonts w:ascii="Wingdings" w:hAnsi="Wingdings" w:hint="default"/>
+        <w:sz w:val="20"/>
+      </w:rPr>
+    </w:lvl>
+    <w:lvl w:ilvl="8" w:tentative="1">
+      <w:start w:val="1"/>
+      <w:numFmt w:val="bullet"/>
+      <w:lvlText w:val=""/>
+      <w:lvlJc w:val="left"/>
+      <w:pPr>
+        <w:tabs>
+          <w:tab w:val="num" w:pos="6480"/>
+        </w:tabs>
+        <w:ind w:left="6480" w:hanging="360"/>
+      </w:pPr>
+      <w:rPr>
+        <w:rFonts w:ascii="Wingdings" w:hAnsi="Wingdings" w:hint="default"/>
+        <w:sz w:val="20"/>
+      </w:rPr>
+    </w:lvl>
+  </w:abstractNum>
+  <w:abstractNum w:abstractNumId="21" w15:restartNumberingAfterBreak="0">
+    <w:nsid w:val="7EF146DF"/>
+    <w:multiLevelType w:val="multilevel"/>
+    <w:tmpl w:val="359C1972"/>
+    <w:lvl w:ilvl="0">
+      <w:start w:val="1"/>
+      <w:numFmt w:val="bullet"/>
+      <w:lvlText w:val=""/>
+      <w:lvlJc w:val="left"/>
+      <w:pPr>
+        <w:tabs>
+          <w:tab w:val="num" w:pos="720"/>
+        </w:tabs>
+        <w:ind w:left="720" w:hanging="360"/>
+      </w:pPr>
+      <w:rPr>
+        <w:rFonts w:ascii="Symbol" w:hAnsi="Symbol" w:hint="default"/>
+        <w:sz w:val="20"/>
+      </w:rPr>
+    </w:lvl>
+    <w:lvl w:ilvl="1" w:tentative="1">
+      <w:start w:val="1"/>
+      <w:numFmt w:val="bullet"/>
+      <w:lvlText w:val="o"/>
+      <w:lvlJc w:val="left"/>
+      <w:pPr>
+        <w:tabs>
+          <w:tab w:val="num" w:pos="1440"/>
+        </w:tabs>
+        <w:ind w:left="1440" w:hanging="360"/>
+      </w:pPr>
+      <w:rPr>
+        <w:rFonts w:ascii="Courier New" w:hAnsi="Courier New" w:hint="default"/>
+        <w:sz w:val="20"/>
+      </w:rPr>
+    </w:lvl>
+    <w:lvl w:ilvl="2" w:tentative="1">
+      <w:start w:val="1"/>
+      <w:numFmt w:val="bullet"/>
+      <w:lvlText w:val=""/>
+      <w:lvlJc w:val="left"/>
+      <w:pPr>
+        <w:tabs>
+          <w:tab w:val="num" w:pos="2160"/>
+        </w:tabs>
+        <w:ind w:left="2160" w:hanging="360"/>
+      </w:pPr>
+      <w:rPr>
+        <w:rFonts w:ascii="Wingdings" w:hAnsi="Wingdings" w:hint="default"/>
+        <w:sz w:val="20"/>
+      </w:rPr>
+    </w:lvl>
+    <w:lvl w:ilvl="3" w:tentative="1">
+      <w:start w:val="1"/>
+      <w:numFmt w:val="bullet"/>
+      <w:lvlText w:val=""/>
+      <w:lvlJc w:val="left"/>
+      <w:pPr>
+        <w:tabs>
+          <w:tab w:val="num" w:pos="2880"/>
+        </w:tabs>
+        <w:ind w:left="2880" w:hanging="360"/>
+      </w:pPr>
+      <w:rPr>
+        <w:rFonts w:ascii="Wingdings" w:hAnsi="Wingdings" w:hint="default"/>
+        <w:sz w:val="20"/>
+      </w:rPr>
+    </w:lvl>
+    <w:lvl w:ilvl="4" w:tentative="1">
+      <w:start w:val="1"/>
+      <w:numFmt w:val="bullet"/>
+      <w:lvlText w:val=""/>
+      <w:lvlJc w:val="left"/>
+      <w:pPr>
+        <w:tabs>
+          <w:tab w:val="num" w:pos="3600"/>
+        </w:tabs>
+        <w:ind w:left="3600" w:hanging="360"/>
+      </w:pPr>
+      <w:rPr>
+        <w:rFonts w:ascii="Wingdings" w:hAnsi="Wingdings" w:hint="default"/>
+        <w:sz w:val="20"/>
+      </w:rPr>
+    </w:lvl>
+    <w:lvl w:ilvl="5" w:tentative="1">
+      <w:start w:val="1"/>
+      <w:numFmt w:val="bullet"/>
+      <w:lvlText w:val=""/>
+      <w:lvlJc w:val="left"/>
+      <w:pPr>
+        <w:tabs>
+          <w:tab w:val="num" w:pos="4320"/>
+        </w:tabs>
+        <w:ind w:left="4320" w:hanging="360"/>
+      </w:pPr>
+      <w:rPr>
+        <w:rFonts w:ascii="Wingdings" w:hAnsi="Wingdings" w:hint="default"/>
+        <w:sz w:val="20"/>
+      </w:rPr>
+    </w:lvl>
+    <w:lvl w:ilvl="6" w:tentative="1">
+      <w:start w:val="1"/>
+      <w:numFmt w:val="bullet"/>
+      <w:lvlText w:val=""/>
+      <w:lvlJc w:val="left"/>
+      <w:pPr>
+        <w:tabs>
+          <w:tab w:val="num" w:pos="5040"/>
+        </w:tabs>
+        <w:ind w:left="5040" w:hanging="360"/>
+      </w:pPr>
+      <w:rPr>
+        <w:rFonts w:ascii="Wingdings" w:hAnsi="Wingdings" w:hint="default"/>
+        <w:sz w:val="20"/>
+      </w:rPr>
+    </w:lvl>
+    <w:lvl w:ilvl="7" w:tentative="1">
+      <w:start w:val="1"/>
+      <w:numFmt w:val="bullet"/>
+      <w:lvlText w:val=""/>
+      <w:lvlJc w:val="left"/>
+      <w:pPr>
+        <w:tabs>
+          <w:tab w:val="num" w:pos="5760"/>
+        </w:tabs>
+        <w:ind w:left="5760" w:hanging="360"/>
+      </w:pPr>
+      <w:rPr>
+        <w:rFonts w:ascii="Wingdings" w:hAnsi="Wingdings" w:hint="default"/>
+        <w:sz w:val="20"/>
+      </w:rPr>
+    </w:lvl>
+    <w:lvl w:ilvl="8" w:tentative="1">
+      <w:start w:val="1"/>
+      <w:numFmt w:val="bullet"/>
+      <w:lvlText w:val=""/>
+      <w:lvlJc w:val="left"/>
+      <w:pPr>
+        <w:tabs>
+          <w:tab w:val="num" w:pos="6480"/>
+        </w:tabs>
+        <w:ind w:left="6480" w:hanging="360"/>
+      </w:pPr>
+      <w:rPr>
+        <w:rFonts w:ascii="Wingdings" w:hAnsi="Wingdings" w:hint="default"/>
+        <w:sz w:val="20"/>
+      </w:rPr>
     </w:lvl>
   </w:abstractNum>
   <w:num w:numId="1" w16cid:durableId="1472820504">
@@ -874,13 +2882,13 @@
     <w:abstractNumId w:val="9"/>
   </w:num>
   <w:num w:numId="5" w16cid:durableId="992829463">
-    <w:abstractNumId w:val="12"/>
+    <w:abstractNumId w:val="18"/>
   </w:num>
   <w:num w:numId="6" w16cid:durableId="1898084308">
     <w:abstractNumId w:val="10"/>
   </w:num>
   <w:num w:numId="7" w16cid:durableId="1800564671">
-    <w:abstractNumId w:val="11"/>
+    <w:abstractNumId w:val="12"/>
   </w:num>
   <w:num w:numId="8" w16cid:durableId="2092696060">
     <w:abstractNumId w:val="7"/>
@@ -905,6 +2913,33 @@
   </w:num>
   <w:num w:numId="15" w16cid:durableId="312297287">
     <w:abstractNumId w:val="0"/>
+  </w:num>
+  <w:num w:numId="16" w16cid:durableId="1408770909">
+    <w:abstractNumId w:val="19"/>
+  </w:num>
+  <w:num w:numId="17" w16cid:durableId="2089111037">
+    <w:abstractNumId w:val="11"/>
+  </w:num>
+  <w:num w:numId="18" w16cid:durableId="1578438799">
+    <w:abstractNumId w:val="15"/>
+  </w:num>
+  <w:num w:numId="19" w16cid:durableId="528881838">
+    <w:abstractNumId w:val="20"/>
+  </w:num>
+  <w:num w:numId="20" w16cid:durableId="947347785">
+    <w:abstractNumId w:val="21"/>
+  </w:num>
+  <w:num w:numId="21" w16cid:durableId="1955552599">
+    <w:abstractNumId w:val="17"/>
+  </w:num>
+  <w:num w:numId="22" w16cid:durableId="2003779518">
+    <w:abstractNumId w:val="13"/>
+  </w:num>
+  <w:num w:numId="23" w16cid:durableId="1489713452">
+    <w:abstractNumId w:val="16"/>
+  </w:num>
+  <w:num w:numId="24" w16cid:durableId="1888566472">
+    <w:abstractNumId w:val="14"/>
   </w:num>
 </w:numbering>
 </file>
@@ -2281,6 +4316,230 @@
       <w:shd w:val="clear" w:color="auto" w:fill="E1DFDD"/>
     </w:rPr>
   </w:style>
+  <w:style w:type="paragraph" w:styleId="ListParagraph">
+    <w:name w:val="List Paragraph"/>
+    <w:basedOn w:val="Normal"/>
+    <w:uiPriority w:val="34"/>
+    <w:unhideWhenUsed/>
+    <w:qFormat/>
+    <w:rsid w:val="003A0D9D"/>
+    <w:pPr>
+      <w:ind w:left="720"/>
+      <w:contextualSpacing/>
+    </w:pPr>
+  </w:style>
+  <w:style w:type="table" w:styleId="GridTable5Dark-Accent5">
+    <w:name w:val="Grid Table 5 Dark Accent 5"/>
+    <w:basedOn w:val="TableNormal"/>
+    <w:uiPriority w:val="50"/>
+    <w:rsid w:val="000708C3"/>
+    <w:pPr>
+      <w:spacing w:after="0" w:line="240" w:lineRule="auto"/>
+    </w:pPr>
+    <w:tblPr>
+      <w:tblStyleRowBandSize w:val="1"/>
+      <w:tblStyleColBandSize w:val="1"/>
+      <w:tblBorders>
+        <w:top w:val="single" w:sz="4" w:space="0" w:color="FFFFFF" w:themeColor="background1"/>
+        <w:left w:val="single" w:sz="4" w:space="0" w:color="FFFFFF" w:themeColor="background1"/>
+        <w:bottom w:val="single" w:sz="4" w:space="0" w:color="FFFFFF" w:themeColor="background1"/>
+        <w:right w:val="single" w:sz="4" w:space="0" w:color="FFFFFF" w:themeColor="background1"/>
+        <w:insideH w:val="single" w:sz="4" w:space="0" w:color="FFFFFF" w:themeColor="background1"/>
+        <w:insideV w:val="single" w:sz="4" w:space="0" w:color="FFFFFF" w:themeColor="background1"/>
+      </w:tblBorders>
+    </w:tblPr>
+    <w:tcPr>
+      <w:shd w:val="clear" w:color="auto" w:fill="E3E7F4" w:themeFill="accent5" w:themeFillTint="33"/>
+    </w:tcPr>
+    <w:tblStylePr w:type="firstRow">
+      <w:rPr>
+        <w:b/>
+        <w:bCs/>
+        <w:color w:val="FFFFFF" w:themeColor="background1"/>
+      </w:rPr>
+      <w:tblPr/>
+      <w:tcPr>
+        <w:tcBorders>
+          <w:top w:val="single" w:sz="4" w:space="0" w:color="FFFFFF" w:themeColor="background1"/>
+          <w:left w:val="single" w:sz="4" w:space="0" w:color="FFFFFF" w:themeColor="background1"/>
+          <w:right w:val="single" w:sz="4" w:space="0" w:color="FFFFFF" w:themeColor="background1"/>
+          <w:insideH w:val="nil"/>
+          <w:insideV w:val="nil"/>
+        </w:tcBorders>
+        <w:shd w:val="clear" w:color="auto" w:fill="738AC8" w:themeFill="accent5"/>
+      </w:tcPr>
+    </w:tblStylePr>
+    <w:tblStylePr w:type="lastRow">
+      <w:rPr>
+        <w:b/>
+        <w:bCs/>
+        <w:color w:val="FFFFFF" w:themeColor="background1"/>
+      </w:rPr>
+      <w:tblPr/>
+      <w:tcPr>
+        <w:tcBorders>
+          <w:left w:val="single" w:sz="4" w:space="0" w:color="FFFFFF" w:themeColor="background1"/>
+          <w:bottom w:val="single" w:sz="4" w:space="0" w:color="FFFFFF" w:themeColor="background1"/>
+          <w:right w:val="single" w:sz="4" w:space="0" w:color="FFFFFF" w:themeColor="background1"/>
+          <w:insideH w:val="nil"/>
+          <w:insideV w:val="nil"/>
+        </w:tcBorders>
+        <w:shd w:val="clear" w:color="auto" w:fill="738AC8" w:themeFill="accent5"/>
+      </w:tcPr>
+    </w:tblStylePr>
+    <w:tblStylePr w:type="firstCol">
+      <w:rPr>
+        <w:b/>
+        <w:bCs/>
+        <w:color w:val="FFFFFF" w:themeColor="background1"/>
+      </w:rPr>
+      <w:tblPr/>
+      <w:tcPr>
+        <w:tcBorders>
+          <w:top w:val="single" w:sz="4" w:space="0" w:color="FFFFFF" w:themeColor="background1"/>
+          <w:left w:val="single" w:sz="4" w:space="0" w:color="FFFFFF" w:themeColor="background1"/>
+          <w:bottom w:val="single" w:sz="4" w:space="0" w:color="FFFFFF" w:themeColor="background1"/>
+          <w:insideV w:val="nil"/>
+        </w:tcBorders>
+        <w:shd w:val="clear" w:color="auto" w:fill="738AC8" w:themeFill="accent5"/>
+      </w:tcPr>
+    </w:tblStylePr>
+    <w:tblStylePr w:type="lastCol">
+      <w:rPr>
+        <w:b/>
+        <w:bCs/>
+        <w:color w:val="FFFFFF" w:themeColor="background1"/>
+      </w:rPr>
+      <w:tblPr/>
+      <w:tcPr>
+        <w:tcBorders>
+          <w:top w:val="single" w:sz="4" w:space="0" w:color="FFFFFF" w:themeColor="background1"/>
+          <w:bottom w:val="single" w:sz="4" w:space="0" w:color="FFFFFF" w:themeColor="background1"/>
+          <w:right w:val="single" w:sz="4" w:space="0" w:color="FFFFFF" w:themeColor="background1"/>
+          <w:insideV w:val="nil"/>
+        </w:tcBorders>
+        <w:shd w:val="clear" w:color="auto" w:fill="738AC8" w:themeFill="accent5"/>
+      </w:tcPr>
+    </w:tblStylePr>
+    <w:tblStylePr w:type="band1Vert">
+      <w:tblPr/>
+      <w:tcPr>
+        <w:shd w:val="clear" w:color="auto" w:fill="C7D0E9" w:themeFill="accent5" w:themeFillTint="66"/>
+      </w:tcPr>
+    </w:tblStylePr>
+    <w:tblStylePr w:type="band1Horz">
+      <w:tblPr/>
+      <w:tcPr>
+        <w:shd w:val="clear" w:color="auto" w:fill="C7D0E9" w:themeFill="accent5" w:themeFillTint="66"/>
+      </w:tcPr>
+    </w:tblStylePr>
+  </w:style>
+  <w:style w:type="table" w:styleId="GridTable5Dark">
+    <w:name w:val="Grid Table 5 Dark"/>
+    <w:basedOn w:val="TableNormal"/>
+    <w:uiPriority w:val="50"/>
+    <w:rsid w:val="000708C3"/>
+    <w:pPr>
+      <w:spacing w:after="0" w:line="240" w:lineRule="auto"/>
+    </w:pPr>
+    <w:tblPr>
+      <w:tblStyleRowBandSize w:val="1"/>
+      <w:tblStyleColBandSize w:val="1"/>
+      <w:tblBorders>
+        <w:top w:val="single" w:sz="4" w:space="0" w:color="FFFFFF" w:themeColor="background1"/>
+        <w:left w:val="single" w:sz="4" w:space="0" w:color="FFFFFF" w:themeColor="background1"/>
+        <w:bottom w:val="single" w:sz="4" w:space="0" w:color="FFFFFF" w:themeColor="background1"/>
+        <w:right w:val="single" w:sz="4" w:space="0" w:color="FFFFFF" w:themeColor="background1"/>
+        <w:insideH w:val="single" w:sz="4" w:space="0" w:color="FFFFFF" w:themeColor="background1"/>
+        <w:insideV w:val="single" w:sz="4" w:space="0" w:color="FFFFFF" w:themeColor="background1"/>
+      </w:tblBorders>
+    </w:tblPr>
+    <w:tcPr>
+      <w:shd w:val="clear" w:color="auto" w:fill="CCCCCC" w:themeFill="text1" w:themeFillTint="33"/>
+    </w:tcPr>
+    <w:tblStylePr w:type="firstRow">
+      <w:rPr>
+        <w:b/>
+        <w:bCs/>
+        <w:color w:val="FFFFFF" w:themeColor="background1"/>
+      </w:rPr>
+      <w:tblPr/>
+      <w:tcPr>
+        <w:tcBorders>
+          <w:top w:val="single" w:sz="4" w:space="0" w:color="FFFFFF" w:themeColor="background1"/>
+          <w:left w:val="single" w:sz="4" w:space="0" w:color="FFFFFF" w:themeColor="background1"/>
+          <w:right w:val="single" w:sz="4" w:space="0" w:color="FFFFFF" w:themeColor="background1"/>
+          <w:insideH w:val="nil"/>
+          <w:insideV w:val="nil"/>
+        </w:tcBorders>
+        <w:shd w:val="clear" w:color="auto" w:fill="000000" w:themeFill="text1"/>
+      </w:tcPr>
+    </w:tblStylePr>
+    <w:tblStylePr w:type="lastRow">
+      <w:rPr>
+        <w:b/>
+        <w:bCs/>
+        <w:color w:val="FFFFFF" w:themeColor="background1"/>
+      </w:rPr>
+      <w:tblPr/>
+      <w:tcPr>
+        <w:tcBorders>
+          <w:left w:val="single" w:sz="4" w:space="0" w:color="FFFFFF" w:themeColor="background1"/>
+          <w:bottom w:val="single" w:sz="4" w:space="0" w:color="FFFFFF" w:themeColor="background1"/>
+          <w:right w:val="single" w:sz="4" w:space="0" w:color="FFFFFF" w:themeColor="background1"/>
+          <w:insideH w:val="nil"/>
+          <w:insideV w:val="nil"/>
+        </w:tcBorders>
+        <w:shd w:val="clear" w:color="auto" w:fill="000000" w:themeFill="text1"/>
+      </w:tcPr>
+    </w:tblStylePr>
+    <w:tblStylePr w:type="firstCol">
+      <w:rPr>
+        <w:b/>
+        <w:bCs/>
+        <w:color w:val="FFFFFF" w:themeColor="background1"/>
+      </w:rPr>
+      <w:tblPr/>
+      <w:tcPr>
+        <w:tcBorders>
+          <w:top w:val="single" w:sz="4" w:space="0" w:color="FFFFFF" w:themeColor="background1"/>
+          <w:left w:val="single" w:sz="4" w:space="0" w:color="FFFFFF" w:themeColor="background1"/>
+          <w:bottom w:val="single" w:sz="4" w:space="0" w:color="FFFFFF" w:themeColor="background1"/>
+          <w:insideV w:val="nil"/>
+        </w:tcBorders>
+        <w:shd w:val="clear" w:color="auto" w:fill="000000" w:themeFill="text1"/>
+      </w:tcPr>
+    </w:tblStylePr>
+    <w:tblStylePr w:type="lastCol">
+      <w:rPr>
+        <w:b/>
+        <w:bCs/>
+        <w:color w:val="FFFFFF" w:themeColor="background1"/>
+      </w:rPr>
+      <w:tblPr/>
+      <w:tcPr>
+        <w:tcBorders>
+          <w:top w:val="single" w:sz="4" w:space="0" w:color="FFFFFF" w:themeColor="background1"/>
+          <w:bottom w:val="single" w:sz="4" w:space="0" w:color="FFFFFF" w:themeColor="background1"/>
+          <w:right w:val="single" w:sz="4" w:space="0" w:color="FFFFFF" w:themeColor="background1"/>
+          <w:insideV w:val="nil"/>
+        </w:tcBorders>
+        <w:shd w:val="clear" w:color="auto" w:fill="000000" w:themeFill="text1"/>
+      </w:tcPr>
+    </w:tblStylePr>
+    <w:tblStylePr w:type="band1Vert">
+      <w:tblPr/>
+      <w:tcPr>
+        <w:shd w:val="clear" w:color="auto" w:fill="999999" w:themeFill="text1" w:themeFillTint="66"/>
+      </w:tcPr>
+    </w:tblStylePr>
+    <w:tblStylePr w:type="band1Horz">
+      <w:tblPr/>
+      <w:tcPr>
+        <w:shd w:val="clear" w:color="auto" w:fill="999999" w:themeFill="text1" w:themeFillTint="66"/>
+      </w:tcPr>
+    </w:tblStylePr>
+  </w:style>
 </w:styles>
 </file>
 

</xml_diff>